<commit_message>
Refactor `StandardParagraph` to simplify expression replacement logic and enhance readability. Add test case for verifying replacement with similar text outside the comment processor.
</commit_message>
<xml_diff>
--- a/src/test/resources/ExpressionReplacementWithCommentsTest.docx
+++ b/src/test/resources/ExpressionReplacementWithCommentsTest.docx
@@ -35,7 +35,15 @@
     </w:p>
     <w:p>
       <w:r>
-        <w:t xml:space="preserve">In this paragraph, the variable foo should not be resolved: </w:t>
+        <w:t xml:space="preserve">In this paragraph, the variable </w:t>
+      </w:r>
+      <w:proofErr w:type="gramStart"/>
+      <w:r>
+        <w:t>foo</w:t>
+      </w:r>
+      <w:proofErr w:type="gramEnd"/>
+      <w:r>
+        <w:t xml:space="preserve"> should not be resolved: </w:t>
       </w:r>
       <w:commentRangeStart w:id="1"/>
       <w:proofErr w:type="spellStart"/>
@@ -49,6 +57,41 @@
       </w:r>
       <w:r>
         <w:t>.</w:t>
+      </w:r>
+    </w:p>
+    <w:p>
+      <w:r>
+        <w:t xml:space="preserve">In this paragraph, we test that </w:t>
+      </w:r>
+      <w:r>
+        <w:rPr>
+          <w:i/>
+          <w:iCs/>
+        </w:rPr>
+        <w:t>only</w:t>
+      </w:r>
+      <w:r>
+        <w:t xml:space="preserve"> the text in the comment (but not other occurrences of the same text) is replaced (also, the format – red, bold – should be retained): name </w:t>
+      </w:r>
+      <w:commentRangeStart w:id="2"/>
+      <w:proofErr w:type="spellStart"/>
+      <w:r>
+        <w:rPr>
+          <w:b/>
+          <w:bCs/>
+          <w:color w:val="FF0000"/>
+        </w:rPr>
+        <w:t>name</w:t>
+      </w:r>
+      <w:commentRangeEnd w:id="2"/>
+      <w:proofErr w:type="spellEnd"/>
+      <w:r>
+        <w:rPr>
+          <w:rStyle w:val="Marquedecommentaire"/>
+          <w:sz w:val="22"/>
+          <w:szCs w:val="22"/>
+        </w:rPr>
+        <w:commentReference w:id="2"/>
       </w:r>
     </w:p>
     <w:sectPr>
@@ -84,6 +127,22 @@
       </w:r>
     </w:p>
   </w:comment>
+  <w:comment w:id="2" w:author="Yoshimi Takano" w:date="2026-07-01T11:15:00Z" w:initials="YT">
+    <w:p>
+      <w:pPr>
+        <w:pStyle w:val="Commentaire"/>
+      </w:pPr>
+      <w:r>
+        <w:rPr>
+          <w:rStyle w:val="Marquedecommentaire"/>
+        </w:rPr>
+        <w:annotationRef/>
+      </w:r>
+      <w:r>
+        <w:t>replaceWith(name)</w:t>
+      </w:r>
+    </w:p>
+  </w:comment>
 </w:comments>
 </file>
 
@@ -91,14 +150,30 @@
 <w15:commentsEx xmlns:wpc="http://schemas.microsoft.com/office/word/2010/wordprocessingCanvas" xmlns:cx="http://schemas.microsoft.com/office/drawing/2014/chartex" xmlns:cx1="http://schemas.microsoft.com/office/drawing/2015/9/8/chartex" xmlns:cx2="http://schemas.microsoft.com/office/drawing/2015/10/21/chartex" xmlns:cx3="http://schemas.microsoft.com/office/drawing/2016/5/9/chartex" xmlns:cx4="http://schemas.microsoft.com/office/drawing/2016/5/10/chartex" xmlns:cx5="http://schemas.microsoft.com/office/drawing/2016/5/11/chartex" xmlns:cx6="http://schemas.microsoft.com/office/drawing/2016/5/12/chartex" xmlns:cx7="http://schemas.microsoft.com/office/drawing/2016/5/13/chartex" xmlns:cx8="http://schemas.microsoft.com/office/drawing/2016/5/14/chartex" xmlns:mc="http://schemas.openxmlformats.org/markup-compatibility/2006" xmlns:aink="http://schemas.microsoft.com/office/drawing/2016/ink" xmlns:am3d="http://schemas.microsoft.com/office/drawing/2017/model3d" xmlns:o="urn:schemas-microsoft-com:office:office" xmlns:oel="http://schemas.microsoft.com/office/2019/extlst" xmlns:r="http://schemas.openxmlformats.org/officeDocument/2006/relationships" xmlns:m="http://schemas.openxmlformats.org/officeDocument/2006/math" xmlns:v="urn:schemas-microsoft-com:vml" xmlns:wp14="http://schemas.microsoft.com/office/word/2010/wordprocessingDrawing" xmlns:wp="http://schemas.openxmlformats.org/drawingml/2006/wordprocessingDrawing" xmlns:w10="urn:schemas-microsoft-com:office:word" xmlns:w="http://schemas.openxmlformats.org/wordprocessingml/2006/main" xmlns:w14="http://schemas.microsoft.com/office/word/2010/wordml" xmlns:w15="http://schemas.microsoft.com/office/word/2012/wordml" xmlns:w16cex="http://schemas.microsoft.com/office/word/2018/wordml/cex" xmlns:w16cid="http://schemas.microsoft.com/office/word/2016/wordml/cid" xmlns:w16="http://schemas.microsoft.com/office/word/2018/wordml" xmlns:w16du="http://schemas.microsoft.com/office/word/2023/wordml/word16du" xmlns:w16sdtdh="http://schemas.microsoft.com/office/word/2020/wordml/sdtdatahash" xmlns:w16sdtfl="http://schemas.microsoft.com/office/word/2024/wordml/sdtformatlock" xmlns:w16se="http://schemas.microsoft.com/office/word/2015/wordml/symex" xmlns:wpg="http://schemas.microsoft.com/office/word/2010/wordprocessingGroup" xmlns:wpi="http://schemas.microsoft.com/office/word/2010/wordprocessingInk" xmlns:wne="http://schemas.microsoft.com/office/word/2006/wordml" xmlns:wps="http://schemas.microsoft.com/office/word/2010/wordprocessingShape" mc:Ignorable="w14 w15 w16se w16cid w16 w16cex w16sdtdh w16sdtfl w16du wp14">
   <w15:commentEx w15:paraId="04D8B63D" w15:done="0"/>
   <w15:commentEx w15:paraId="4788D41E" w15:done="0"/>
+  <w15:commentEx w15:paraId="0A5B4C06" w15:done="0"/>
 </w15:commentsEx>
+</file>
+
+<file path=word/commentsExtensible.xml><?xml version="1.0" encoding="utf-8"?>
+<w16cex:commentsExtensible xmlns:wpc="http://schemas.microsoft.com/office/word/2010/wordprocessingCanvas" xmlns:cx="http://schemas.microsoft.com/office/drawing/2014/chartex" xmlns:cx1="http://schemas.microsoft.com/office/drawing/2015/9/8/chartex" xmlns:cx2="http://schemas.microsoft.com/office/drawing/2015/10/21/chartex" xmlns:cx3="http://schemas.microsoft.com/office/drawing/2016/5/9/chartex" xmlns:cx4="http://schemas.microsoft.com/office/drawing/2016/5/10/chartex" xmlns:cx5="http://schemas.microsoft.com/office/drawing/2016/5/11/chartex" xmlns:cx6="http://schemas.microsoft.com/office/drawing/2016/5/12/chartex" xmlns:cx7="http://schemas.microsoft.com/office/drawing/2016/5/13/chartex" xmlns:cx8="http://schemas.microsoft.com/office/drawing/2016/5/14/chartex" xmlns:cr="http://schemas.microsoft.com/office/comments/2020/reactions" xmlns:mc="http://schemas.openxmlformats.org/markup-compatibility/2006" xmlns:aink="http://schemas.microsoft.com/office/drawing/2016/ink" xmlns:am3d="http://schemas.microsoft.com/office/drawing/2017/model3d" xmlns:o="urn:schemas-microsoft-com:office:office" xmlns:oel="http://schemas.microsoft.com/office/2019/extlst" xmlns:r="http://schemas.openxmlformats.org/officeDocument/2006/relationships" xmlns:m="http://schemas.openxmlformats.org/officeDocument/2006/math" xmlns:v="urn:schemas-microsoft-com:vml" xmlns:wp14="http://schemas.microsoft.com/office/word/2010/wordprocessingDrawing" xmlns:wp="http://schemas.openxmlformats.org/drawingml/2006/wordprocessingDrawing" xmlns:w10="urn:schemas-microsoft-com:office:word" xmlns:w="http://schemas.openxmlformats.org/wordprocessingml/2006/main" xmlns:w14="http://schemas.microsoft.com/office/word/2010/wordml" xmlns:w15="http://schemas.microsoft.com/office/word/2012/wordml" xmlns:w16cex="http://schemas.microsoft.com/office/word/2018/wordml/cex" xmlns:w16cid="http://schemas.microsoft.com/office/word/2016/wordml/cid" xmlns:w16="http://schemas.microsoft.com/office/word/2018/wordml" xmlns:w16du="http://schemas.microsoft.com/office/word/2023/wordml/word16du" xmlns:w16sdtdh="http://schemas.microsoft.com/office/word/2020/wordml/sdtdatahash" xmlns:w16sdtfl="http://schemas.microsoft.com/office/word/2024/wordml/sdtformatlock" xmlns:w16se="http://schemas.microsoft.com/office/word/2015/wordml/symex" xmlns:wpg="http://schemas.microsoft.com/office/word/2010/wordprocessingGroup" xmlns:wpi="http://schemas.microsoft.com/office/word/2010/wordprocessingInk" xmlns:wne="http://schemas.microsoft.com/office/word/2006/wordml" xmlns:wps="http://schemas.microsoft.com/office/word/2010/wordprocessingShape" mc:Ignorable="w14 w15 w16se w16cid w16 w16cex w16sdtdh w16sdtfl cr w16du wp14">
+  <w16cex:commentExtensible w16cex:durableId="54171DBC" w16cex:dateUtc="2026-07-01T09:15:00Z"/>
+</w16cex:commentsExtensible>
 </file>
 
 <file path=word/commentsIds.xml><?xml version="1.0" encoding="utf-8"?>
 <w16cid:commentsIds xmlns:wpc="http://schemas.microsoft.com/office/word/2010/wordprocessingCanvas" xmlns:cx="http://schemas.microsoft.com/office/drawing/2014/chartex" xmlns:cx1="http://schemas.microsoft.com/office/drawing/2015/9/8/chartex" xmlns:cx2="http://schemas.microsoft.com/office/drawing/2015/10/21/chartex" xmlns:cx3="http://schemas.microsoft.com/office/drawing/2016/5/9/chartex" xmlns:cx4="http://schemas.microsoft.com/office/drawing/2016/5/10/chartex" xmlns:cx5="http://schemas.microsoft.com/office/drawing/2016/5/11/chartex" xmlns:cx6="http://schemas.microsoft.com/office/drawing/2016/5/12/chartex" xmlns:cx7="http://schemas.microsoft.com/office/drawing/2016/5/13/chartex" xmlns:cx8="http://schemas.microsoft.com/office/drawing/2016/5/14/chartex" xmlns:mc="http://schemas.openxmlformats.org/markup-compatibility/2006" xmlns:aink="http://schemas.microsoft.com/office/drawing/2016/ink" xmlns:am3d="http://schemas.microsoft.com/office/drawing/2017/model3d" xmlns:o="urn:schemas-microsoft-com:office:office" xmlns:oel="http://schemas.microsoft.com/office/2019/extlst" xmlns:r="http://schemas.openxmlformats.org/officeDocument/2006/relationships" xmlns:m="http://schemas.openxmlformats.org/officeDocument/2006/math" xmlns:v="urn:schemas-microsoft-com:vml" xmlns:wp14="http://schemas.microsoft.com/office/word/2010/wordprocessingDrawing" xmlns:wp="http://schemas.openxmlformats.org/drawingml/2006/wordprocessingDrawing" xmlns:w10="urn:schemas-microsoft-com:office:word" xmlns:w="http://schemas.openxmlformats.org/wordprocessingml/2006/main" xmlns:w14="http://schemas.microsoft.com/office/word/2010/wordml" xmlns:w15="http://schemas.microsoft.com/office/word/2012/wordml" xmlns:w16cex="http://schemas.microsoft.com/office/word/2018/wordml/cex" xmlns:w16cid="http://schemas.microsoft.com/office/word/2016/wordml/cid" xmlns:w16="http://schemas.microsoft.com/office/word/2018/wordml" xmlns:w16du="http://schemas.microsoft.com/office/word/2023/wordml/word16du" xmlns:w16sdtdh="http://schemas.microsoft.com/office/word/2020/wordml/sdtdatahash" xmlns:w16sdtfl="http://schemas.microsoft.com/office/word/2024/wordml/sdtformatlock" xmlns:w16se="http://schemas.microsoft.com/office/word/2015/wordml/symex" xmlns:wpg="http://schemas.microsoft.com/office/word/2010/wordprocessingGroup" xmlns:wpi="http://schemas.microsoft.com/office/word/2010/wordprocessingInk" xmlns:wne="http://schemas.microsoft.com/office/word/2006/wordml" xmlns:wps="http://schemas.microsoft.com/office/word/2010/wordprocessingShape" mc:Ignorable="w14 w15 w16se w16cid w16 w16cex w16sdtdh w16sdtfl w16du wp14">
   <w16cid:commentId w16cid:paraId="04D8B63D" w16cid:durableId="7FFAC9C4"/>
   <w16cid:commentId w16cid:paraId="4788D41E" w16cid:durableId="4B5106FA"/>
+  <w16cid:commentId w16cid:paraId="0A5B4C06" w16cid:durableId="54171DBC"/>
 </w16cid:commentsIds>
+</file>
+
+<file path=word/people.xml><?xml version="1.0" encoding="utf-8"?>
+<w15:people xmlns:wpc="http://schemas.microsoft.com/office/word/2010/wordprocessingCanvas" xmlns:cx="http://schemas.microsoft.com/office/drawing/2014/chartex" xmlns:cx1="http://schemas.microsoft.com/office/drawing/2015/9/8/chartex" xmlns:cx2="http://schemas.microsoft.com/office/drawing/2015/10/21/chartex" xmlns:cx3="http://schemas.microsoft.com/office/drawing/2016/5/9/chartex" xmlns:cx4="http://schemas.microsoft.com/office/drawing/2016/5/10/chartex" xmlns:cx5="http://schemas.microsoft.com/office/drawing/2016/5/11/chartex" xmlns:cx6="http://schemas.microsoft.com/office/drawing/2016/5/12/chartex" xmlns:cx7="http://schemas.microsoft.com/office/drawing/2016/5/13/chartex" xmlns:cx8="http://schemas.microsoft.com/office/drawing/2016/5/14/chartex" xmlns:mc="http://schemas.openxmlformats.org/markup-compatibility/2006" xmlns:aink="http://schemas.microsoft.com/office/drawing/2016/ink" xmlns:am3d="http://schemas.microsoft.com/office/drawing/2017/model3d" xmlns:o="urn:schemas-microsoft-com:office:office" xmlns:oel="http://schemas.microsoft.com/office/2019/extlst" xmlns:r="http://schemas.openxmlformats.org/officeDocument/2006/relationships" xmlns:m="http://schemas.openxmlformats.org/officeDocument/2006/math" xmlns:v="urn:schemas-microsoft-com:vml" xmlns:wp14="http://schemas.microsoft.com/office/word/2010/wordprocessingDrawing" xmlns:wp="http://schemas.openxmlformats.org/drawingml/2006/wordprocessingDrawing" xmlns:w10="urn:schemas-microsoft-com:office:word" xmlns:w="http://schemas.openxmlformats.org/wordprocessingml/2006/main" xmlns:w14="http://schemas.microsoft.com/office/word/2010/wordml" xmlns:w15="http://schemas.microsoft.com/office/word/2012/wordml" xmlns:w16cex="http://schemas.microsoft.com/office/word/2018/wordml/cex" xmlns:w16cid="http://schemas.microsoft.com/office/word/2016/wordml/cid" xmlns:w16="http://schemas.microsoft.com/office/word/2018/wordml" xmlns:w16du="http://schemas.microsoft.com/office/word/2023/wordml/word16du" xmlns:w16sdtdh="http://schemas.microsoft.com/office/word/2020/wordml/sdtdatahash" xmlns:w16sdtfl="http://schemas.microsoft.com/office/word/2024/wordml/sdtformatlock" xmlns:w16se="http://schemas.microsoft.com/office/word/2015/wordml/symex" xmlns:wpg="http://schemas.microsoft.com/office/word/2010/wordprocessingGroup" xmlns:wpi="http://schemas.microsoft.com/office/word/2010/wordprocessingInk" xmlns:wne="http://schemas.microsoft.com/office/word/2006/wordml" xmlns:wps="http://schemas.microsoft.com/office/word/2010/wordprocessingShape" mc:Ignorable="w14 w15 w16se w16cid w16 w16cex w16sdtdh w16sdtfl w16du wp14">
+  <w15:person w15:author="Yoshimi Takano">
+    <w15:presenceInfo w15:providerId="Windows Live" w15:userId="d4730167bad3b40e"/>
+  </w15:person>
+</w15:people>
 </file>
 
 <file path=word/styles.xml><?xml version="1.0" encoding="utf-8"?>

</xml_diff>